<commit_message>
Update project summary document
</commit_message>
<xml_diff>
--- a/pressure_encoder_documentation/pressure_encoder_summary.docx
+++ b/pressure_encoder_documentation/pressure_encoder_summary.docx
@@ -660,7 +660,7 @@
           <w:lang w:val="en-US"/>
         </w:rPr>
         <w:drawing>
-          <wp:inline distT="0" distB="0" distL="0" distR="0" wp14:anchorId="3E0D0054" wp14:editId="1479503C">
+          <wp:inline distT="0" distB="0" distL="0" distR="0" wp14:anchorId="3E0D0054" wp14:editId="237C85D0">
             <wp:extent cx="5943600" cy="3123565"/>
             <wp:effectExtent l="0" t="0" r="0" b="635"/>
             <wp:docPr id="1242303046" name="Picture 3" descr="A computer screen shot of a circuit board&#10;&#10;AI-generated content may be incorrect."/>
@@ -3945,15 +3945,7 @@
           <w:color w:val="000000" w:themeColor="text1"/>
           <w:lang w:val="en-US"/>
         </w:rPr>
-        <w:t xml:space="preserve"> </w:t>
-      </w:r>
-      <w:r>
-        <w:rPr>
-          <w:rFonts w:ascii="Times New Roman" w:hAnsi="Times New Roman" w:cs="Times New Roman"/>
-          <w:color w:val="000000" w:themeColor="text1"/>
-          <w:lang w:val="en-US"/>
-        </w:rPr>
-        <w:t>Pressure values read by the sensor are not absolute, but instead relative to atmospheric pressure.</w:t>
+        <w:t xml:space="preserve"> Pressure values read by the sensor are not absolute, but instead relative to atmospheric pressure.</w:t>
       </w:r>
     </w:p>
     <w:p>
@@ -4733,6 +4725,24 @@
           <w:color w:val="000000" w:themeColor="text1"/>
           <w:lang w:val="en-US"/>
         </w:rPr>
+        <w:t>To run the program, the user enters “run” into the serial terminal.</w:t>
+      </w:r>
+    </w:p>
+    <w:p>
+      <w:pPr>
+        <w:spacing w:line="360" w:lineRule="auto"/>
+        <w:rPr>
+          <w:rFonts w:ascii="Times New Roman" w:hAnsi="Times New Roman" w:cs="Times New Roman"/>
+          <w:color w:val="000000" w:themeColor="text1"/>
+          <w:lang w:val="en-US"/>
+        </w:rPr>
+      </w:pPr>
+      <w:r>
+        <w:rPr>
+          <w:rFonts w:ascii="Times New Roman" w:hAnsi="Times New Roman" w:cs="Times New Roman"/>
+          <w:color w:val="000000" w:themeColor="text1"/>
+          <w:lang w:val="en-US"/>
+        </w:rPr>
         <w:t>The initial recording and solenoid time are calculated by the CSV interpreter based on the period from the first timestamp listed in the CSV file to the final timestamp.</w:t>
       </w:r>
       <w:r>
@@ -4851,6 +4861,61 @@
           <w:color w:val="000000" w:themeColor="text1"/>
           <w:lang w:val="en-US"/>
         </w:rPr>
+        <w:t>Programs in the comma-separated serial format can also be entered directly after the “run” command. For example, if the solenoid must be turned on and off while the needle valve is open, this cannot be accomplished using the CSV interpreter. A program must be entered directly after “run”, for example:</w:t>
+      </w:r>
+    </w:p>
+    <w:p>
+      <w:pPr>
+        <w:spacing w:line="360" w:lineRule="auto"/>
+        <w:rPr>
+          <w:rFonts w:ascii="Times New Roman" w:hAnsi="Times New Roman" w:cs="Times New Roman"/>
+          <w:color w:val="000000" w:themeColor="text1"/>
+          <w:lang w:val="en-US"/>
+        </w:rPr>
+      </w:pPr>
+      <w:r>
+        <w:rPr>
+          <w:rFonts w:ascii="Times New Roman" w:hAnsi="Times New Roman" w:cs="Times New Roman"/>
+          <w:color w:val="000000" w:themeColor="text1"/>
+          <w:lang w:val="en-US"/>
+        </w:rPr>
+        <w:tab/>
+        <w:t>r100,s500,t1000,s500,t1000,s500,t1000,s500,t1000</w:t>
+      </w:r>
+    </w:p>
+    <w:p>
+      <w:pPr>
+        <w:spacing w:line="360" w:lineRule="auto"/>
+        <w:rPr>
+          <w:rFonts w:ascii="Times New Roman" w:hAnsi="Times New Roman" w:cs="Times New Roman"/>
+          <w:color w:val="000000" w:themeColor="text1"/>
+          <w:lang w:val="en-US"/>
+        </w:rPr>
+      </w:pPr>
+      <w:r>
+        <w:rPr>
+          <w:rFonts w:ascii="Times New Roman" w:hAnsi="Times New Roman" w:cs="Times New Roman"/>
+          <w:color w:val="000000" w:themeColor="text1"/>
+          <w:lang w:val="en-US"/>
+        </w:rPr>
+        <w:t>This example program records for 100 frames and opens the solenoid for 0.5 seconds over four 1-second time intervals, causing the solenoid to toggle on and off every 0.5 seconds.</w:t>
+      </w:r>
+    </w:p>
+    <w:p>
+      <w:pPr>
+        <w:spacing w:line="360" w:lineRule="auto"/>
+        <w:rPr>
+          <w:rFonts w:ascii="Times New Roman" w:hAnsi="Times New Roman" w:cs="Times New Roman"/>
+          <w:color w:val="000000" w:themeColor="text1"/>
+          <w:lang w:val="en-US"/>
+        </w:rPr>
+      </w:pPr>
+      <w:r>
+        <w:rPr>
+          <w:rFonts w:ascii="Times New Roman" w:hAnsi="Times New Roman" w:cs="Times New Roman"/>
+          <w:color w:val="000000" w:themeColor="text1"/>
+          <w:lang w:val="en-US"/>
+        </w:rPr>
         <w:t xml:space="preserve">Upon completion of a record instruction, the data is saved to the </w:t>
       </w:r>
       <w:r>
@@ -4885,6 +4950,7 @@
           <w:color w:val="000000" w:themeColor="text1"/>
           <w:lang w:val="en-US"/>
         </w:rPr>
+        <w:lastRenderedPageBreak/>
         <w:t>Output force in grams is calculated using a simplified form of the Bernoulli equation which assumes a horizontal tube network (no change in gravitational potential) and a tissue sample less than one tube diameter (less than 4 mm) away from the end of the outlet.</w:t>
       </w:r>
       <w:r>
@@ -5036,7 +5102,6 @@
           <w:color w:val="000000" w:themeColor="text1"/>
           <w:lang w:val="en-US"/>
         </w:rPr>
-        <w:lastRenderedPageBreak/>
         <w:t xml:space="preserve">This </w:t>
       </w:r>
       <w:r>
@@ -5298,23 +5363,7 @@
           <w:color w:val="000000" w:themeColor="text1"/>
           <w:lang w:val="en-US"/>
         </w:rPr>
-        <w:t xml:space="preserve">, and </w:t>
-      </w:r>
-      <w:r>
-        <w:rPr>
-          <w:rFonts w:ascii="Times New Roman" w:hAnsi="Times New Roman" w:cs="Times New Roman"/>
-          <w:color w:val="000000" w:themeColor="text1"/>
-          <w:lang w:val="en-US"/>
-        </w:rPr>
-        <w:t>ρ</w:t>
-      </w:r>
-      <w:r>
-        <w:rPr>
-          <w:rFonts w:ascii="Times New Roman" w:hAnsi="Times New Roman" w:cs="Times New Roman"/>
-          <w:color w:val="000000" w:themeColor="text1"/>
-          <w:lang w:val="en-US"/>
-        </w:rPr>
-        <w:t xml:space="preserve"> is equal to the density of the fluid</w:t>
+        <w:t>, and ρ is equal to the density of the fluid</w:t>
       </w:r>
       <w:r>
         <w:rPr>
@@ -6112,6 +6161,7 @@
           <w:color w:val="000000" w:themeColor="text1"/>
           <w:lang w:val="en-US"/>
         </w:rPr>
+        <w:lastRenderedPageBreak/>
         <w:t>If the input velocity is very low (outlet of air pressure regulator and tubing network inlet are at about the same pressure</w:t>
       </w:r>
       <w:r>
@@ -6469,33 +6519,12 @@
           <w:lang w:val="en-US"/>
         </w:rPr>
       </w:pPr>
-    </w:p>
-    <w:p>
-      <w:pPr>
-        <w:spacing w:line="360" w:lineRule="auto"/>
-        <w:rPr>
-          <w:rFonts w:ascii="Times New Roman" w:hAnsi="Times New Roman" w:cs="Times New Roman"/>
-          <w:color w:val="000000" w:themeColor="text1"/>
-          <w:lang w:val="en-US"/>
-        </w:rPr>
-      </w:pPr>
-    </w:p>
-    <w:p>
-      <w:pPr>
-        <w:spacing w:line="360" w:lineRule="auto"/>
-        <w:rPr>
-          <w:rFonts w:ascii="Times New Roman" w:hAnsi="Times New Roman" w:cs="Times New Roman"/>
-          <w:color w:val="000000" w:themeColor="text1"/>
-          <w:lang w:val="en-US"/>
-        </w:rPr>
-      </w:pPr>
-      <w:r>
-        <w:rPr>
-          <w:rFonts w:ascii="Times New Roman" w:hAnsi="Times New Roman" w:cs="Times New Roman"/>
-          <w:color w:val="000000" w:themeColor="text1"/>
-          <w:lang w:val="en-US"/>
-        </w:rPr>
-        <w:lastRenderedPageBreak/>
+      <w:r>
+        <w:rPr>
+          <w:rFonts w:ascii="Times New Roman" w:hAnsi="Times New Roman" w:cs="Times New Roman"/>
+          <w:color w:val="000000" w:themeColor="text1"/>
+          <w:lang w:val="en-US"/>
+        </w:rPr>
         <w:t>Substituting Equation (6) back into Equation (4)</w:t>
       </w:r>
       <w:r>
@@ -7377,7 +7406,16 @@
           <w:color w:val="000000" w:themeColor="text1"/>
           <w:lang w:val="en-US"/>
         </w:rPr>
-        <w:t xml:space="preserve"> is the difference between the analogRead values of the high calibration point (at 20 kPa) and the zero calibration point, while 20 is the 20 kPa scaling factor.</w:t>
+        <w:t xml:space="preserve"> is the difference between the analogRead </w:t>
+      </w:r>
+      <w:r>
+        <w:rPr>
+          <w:rFonts w:ascii="Times New Roman" w:hAnsi="Times New Roman" w:cs="Times New Roman"/>
+          <w:color w:val="000000" w:themeColor="text1"/>
+          <w:lang w:val="en-US"/>
+        </w:rPr>
+        <w:lastRenderedPageBreak/>
+        <w:t>values of the high calibration point (at 20 kPa) and the zero calibration point, while 20 is the 20 kPa scaling factor.</w:t>
       </w:r>
     </w:p>
     <w:p>
@@ -7536,6 +7574,35 @@
           <w:lang w:val="en-US"/>
         </w:rPr>
         <w:t>.</w:t>
+      </w:r>
+    </w:p>
+    <w:p>
+      <w:pPr>
+        <w:rPr>
+          <w:rFonts w:ascii="Times New Roman" w:hAnsi="Times New Roman" w:cs="Times New Roman"/>
+          <w:b/>
+          <w:bCs/>
+          <w:i/>
+          <w:iCs/>
+          <w:color w:val="000000" w:themeColor="text1"/>
+          <w:sz w:val="48"/>
+          <w:szCs w:val="48"/>
+          <w:lang w:val="en-US"/>
+        </w:rPr>
+      </w:pPr>
+      <w:r>
+        <w:rPr>
+          <w:rFonts w:ascii="Times New Roman" w:hAnsi="Times New Roman" w:cs="Times New Roman"/>
+          <w:b/>
+          <w:bCs/>
+          <w:i/>
+          <w:iCs/>
+          <w:color w:val="000000" w:themeColor="text1"/>
+          <w:sz w:val="48"/>
+          <w:szCs w:val="48"/>
+          <w:lang w:val="en-US"/>
+        </w:rPr>
+        <w:br w:type="page"/>
       </w:r>
     </w:p>
     <w:p>

</xml_diff>